<commit_message>
Se agrega archivo SQL para la creación de la Base de datos con sus tablas correspondientes y se modifican los nombres de los integrantes del archivo Word.
</commit_message>
<xml_diff>
--- a/documentacion/TPI_BaseDeDatosII_Grupo15.docx
+++ b/documentacion/TPI_BaseDeDatosII_Grupo15.docx
@@ -1,6 +1,6 @@
 
 <file path=word/document.xml><?xml version="1.0" encoding="utf-8"?>
-<w:document xmlns:wpc="http://schemas.microsoft.com/office/word/2010/wordprocessingCanvas" xmlns:cx="http://schemas.microsoft.com/office/drawing/2014/chartex" xmlns:cx1="http://schemas.microsoft.com/office/drawing/2015/9/8/chartex" xmlns:cx2="http://schemas.microsoft.com/office/drawing/2015/10/21/chartex" xmlns:cx3="http://schemas.microsoft.com/office/drawing/2016/5/9/chartex" xmlns:cx4="http://schemas.microsoft.com/office/drawing/2016/5/10/chartex" xmlns:cx5="http://schemas.microsoft.com/office/drawing/2016/5/11/chartex" xmlns:cx6="http://schemas.microsoft.com/office/drawing/2016/5/12/chartex" xmlns:cx7="http://schemas.microsoft.com/office/drawing/2016/5/13/chartex" xmlns:cx8="http://schemas.microsoft.com/office/drawing/2016/5/14/chartex" xmlns:mc="http://schemas.openxmlformats.org/markup-compatibility/2006" xmlns:aink="http://schemas.microsoft.com/office/drawing/2016/ink" xmlns:am3d="http://schemas.microsoft.com/office/drawing/2017/model3d" xmlns:o="urn:schemas-microsoft-com:office:office" xmlns:oel="http://schemas.microsoft.com/office/2019/extlst" xmlns:r="http://schemas.openxmlformats.org/officeDocument/2006/relationships" xmlns:m="http://schemas.openxmlformats.org/officeDocument/2006/math" xmlns:v="urn:schemas-microsoft-com:vml" xmlns:wp14="http://schemas.microsoft.com/office/word/2010/wordprocessingDrawing" xmlns:wp="http://schemas.openxmlformats.org/drawingml/2006/wordprocessingDrawing" xmlns:w10="urn:schemas-microsoft-com:office:word" xmlns:w="http://schemas.openxmlformats.org/wordprocessingml/2006/main" xmlns:w14="http://schemas.microsoft.com/office/word/2010/wordml" xmlns:w15="http://schemas.microsoft.com/office/word/2012/wordml" xmlns:w16cex="http://schemas.microsoft.com/office/word/2018/wordml/cex" xmlns:w16cid="http://schemas.microsoft.com/office/word/2016/wordml/cid" xmlns:w16="http://schemas.microsoft.com/office/word/2018/wordml" xmlns:w16du="http://schemas.microsoft.com/office/word/2023/wordml/word16du" xmlns:w16sdtdh="http://schemas.microsoft.com/office/word/2020/wordml/sdtdatahash" xmlns:w16sdtfl="http://schemas.microsoft.com/office/word/2024/wordml/sdtformatlock" xmlns:w16se="http://schemas.microsoft.com/office/word/2015/wordml/symex" xmlns:wpg="http://schemas.microsoft.com/office/word/2010/wordprocessingGroup" xmlns:wpi="http://schemas.microsoft.com/office/word/2010/wordprocessingInk" xmlns:wne="http://schemas.microsoft.com/office/word/2006/wordml" xmlns:wps="http://schemas.microsoft.com/office/word/2010/wordprocessingShape" mc:Ignorable="w14 w15 w16se w16cid w16 w16cex w16sdtdh w16sdtfl w16du wp14">
+<w:document xmlns:wpc="http://schemas.microsoft.com/office/word/2010/wordprocessingCanvas" xmlns:cx="http://schemas.microsoft.com/office/drawing/2014/chartex" xmlns:cx1="http://schemas.microsoft.com/office/drawing/2015/9/8/chartex" xmlns:cx2="http://schemas.microsoft.com/office/drawing/2015/10/21/chartex" xmlns:cx3="http://schemas.microsoft.com/office/drawing/2016/5/9/chartex" xmlns:cx4="http://schemas.microsoft.com/office/drawing/2016/5/10/chartex" xmlns:cx5="http://schemas.microsoft.com/office/drawing/2016/5/11/chartex" xmlns:cx6="http://schemas.microsoft.com/office/drawing/2016/5/12/chartex" xmlns:cx7="http://schemas.microsoft.com/office/drawing/2016/5/13/chartex" xmlns:cx8="http://schemas.microsoft.com/office/drawing/2016/5/14/chartex" xmlns:mc="http://schemas.openxmlformats.org/markup-compatibility/2006" xmlns:aink="http://schemas.microsoft.com/office/drawing/2016/ink" xmlns:am3d="http://schemas.microsoft.com/office/drawing/2017/model3d" xmlns:o="urn:schemas-microsoft-com:office:office" xmlns:r="http://schemas.openxmlformats.org/officeDocument/2006/relationships" xmlns:m="http://schemas.openxmlformats.org/officeDocument/2006/math" xmlns:v="urn:schemas-microsoft-com:vml" xmlns:wp14="http://schemas.microsoft.com/office/word/2010/wordprocessingDrawing" xmlns:wp="http://schemas.openxmlformats.org/drawingml/2006/wordprocessingDrawing" xmlns:w10="urn:schemas-microsoft-com:office:word" xmlns:w="http://schemas.openxmlformats.org/wordprocessingml/2006/main" xmlns:w14="http://schemas.microsoft.com/office/word/2010/wordml" xmlns:w15="http://schemas.microsoft.com/office/word/2012/wordml" xmlns:w16cex="http://schemas.microsoft.com/office/word/2018/wordml/cex" xmlns:w16cid="http://schemas.microsoft.com/office/word/2016/wordml/cid" xmlns:w16="http://schemas.microsoft.com/office/word/2018/wordml" xmlns:w16sdtdh="http://schemas.microsoft.com/office/word/2020/wordml/sdtdatahash" xmlns:w16se="http://schemas.microsoft.com/office/word/2015/wordml/symex" xmlns:wpg="http://schemas.microsoft.com/office/word/2010/wordprocessingGroup" xmlns:wpi="http://schemas.microsoft.com/office/word/2010/wordprocessingInk" xmlns:wne="http://schemas.microsoft.com/office/word/2006/wordml" xmlns:wps="http://schemas.microsoft.com/office/word/2010/wordprocessingShape" mc:Ignorable="w14 w15 w16se w16cid w16 w16cex w16sdtdh wp14">
   <w:body>
     <w:p>
       <w:pPr>
@@ -71,7 +71,7 @@
               </wp:anchor>
             </w:drawing>
           </mc:Choice>
-          <mc:Fallback>
+          <mc:Fallback xmlns:w16sdtfl="http://schemas.microsoft.com/office/word/2024/wordml/sdtformatlock" xmlns:w16du="http://schemas.microsoft.com/office/word/2023/wordml/word16du" xmlns:oel="http://schemas.microsoft.com/office/2019/extlst">
             <w:pict>
               <v:rect w14:anchorId="28DD740B" id="Rectángulo 3" o:spid="_x0000_s1026" style="position:absolute;left:0;text-align:left;margin-left:26.65pt;margin-top:-70.9pt;width:36.65pt;height:844.15pt;z-index:-251658240;visibility:visible;mso-wrap-style:square;mso-wrap-distance-left:0;mso-wrap-distance-top:0;mso-wrap-distance-right:0;mso-wrap-distance-bottom:0;mso-position-horizontal:absolute;mso-position-horizontal-relative:margin;mso-position-vertical:absolute;mso-position-vertical-relative:margin;v-text-anchor:middle" o:gfxdata="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" fillcolor="#c0504d [3205]" stroked="f">
                 <v:textbox inset="2.53958mm,2.53958mm,2.53958mm,2.53958mm">
@@ -154,7 +154,7 @@
               </wp:anchor>
             </w:drawing>
           </mc:Choice>
-          <mc:Fallback>
+          <mc:Fallback xmlns:w16sdtfl="http://schemas.microsoft.com/office/word/2024/wordml/sdtformatlock" xmlns:w16du="http://schemas.microsoft.com/office/word/2023/wordml/word16du" xmlns:oel="http://schemas.microsoft.com/office/2019/extlst">
             <w:pict>
               <v:rect w14:anchorId="35F05470" id="Rectángulo 4" o:spid="_x0000_s1027" style="position:absolute;left:0;text-align:left;margin-left:-18.45pt;margin-top:-71.95pt;width:47.4pt;height:844.15pt;z-index:-251657216;visibility:visible;mso-wrap-style:square;mso-wrap-distance-left:0;mso-wrap-distance-top:0;mso-wrap-distance-right:0;mso-wrap-distance-bottom:0;mso-position-horizontal:absolute;mso-position-horizontal-relative:margin;mso-position-vertical:absolute;mso-position-vertical-relative:margin;v-text-anchor:middle" o:gfxdata="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" fillcolor="#4f81bd [3204]" stroked="f">
                 <v:textbox inset="2.53958mm,2.53958mm,2.53958mm,2.53958mm">
@@ -237,7 +237,7 @@
               </wp:anchor>
             </w:drawing>
           </mc:Choice>
-          <mc:Fallback>
+          <mc:Fallback xmlns:w16sdtfl="http://schemas.microsoft.com/office/word/2024/wordml/sdtformatlock" xmlns:w16du="http://schemas.microsoft.com/office/word/2023/wordml/word16du" xmlns:oel="http://schemas.microsoft.com/office/2019/extlst">
             <w:pict>
               <v:rect w14:anchorId="4D95C700" id="Rectángulo 1" o:spid="_x0000_s1028" style="position:absolute;left:0;text-align:left;margin-left:-88.05pt;margin-top:-71.95pt;width:74.25pt;height:844.15pt;z-index:-251656192;visibility:visible;mso-wrap-style:square;mso-wrap-distance-left:0;mso-wrap-distance-top:0;mso-wrap-distance-right:0;mso-wrap-distance-bottom:0;mso-position-horizontal:absolute;mso-position-horizontal-relative:margin;mso-position-vertical:absolute;mso-position-vertical-relative:margin;v-text-anchor:middle" o:gfxdata="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" fillcolor="#0b5394" stroked="f">
                 <v:textbox inset="2.53958mm,2.53958mm,2.53958mm,2.53958mm">
@@ -529,7 +529,14 @@
                                 <w:sz w:val="32"/>
                               </w:rPr>
                               <w:br/>
-                              <w:t>Cristian Ariel Tesaglio</w:t>
+                            </w:r>
+                            <w:r>
+                              <w:rPr>
+                                <w:rFonts w:ascii="Montserrat" w:eastAsia="Montserrat" w:hAnsi="Montserrat" w:cs="Montserrat"/>
+                                <w:color w:val="000000"/>
+                                <w:sz w:val="32"/>
+                              </w:rPr>
+                              <w:t>Matías Hernán Ramírez</w:t>
                             </w:r>
                             <w:r>
                               <w:rPr>
@@ -538,7 +545,22 @@
                                 <w:sz w:val="32"/>
                               </w:rPr>
                               <w:br/>
-                              <w:t>Martín Ignacio Torres</w:t>
+                            </w:r>
+                            <w:r>
+                              <w:rPr>
+                                <w:rFonts w:ascii="Montserrat" w:eastAsia="Montserrat" w:hAnsi="Montserrat" w:cs="Montserrat"/>
+                                <w:color w:val="000000"/>
+                                <w:sz w:val="32"/>
+                              </w:rPr>
+                              <w:t xml:space="preserve">Germán Gabriel </w:t>
+                            </w:r>
+                            <w:r>
+                              <w:rPr>
+                                <w:rFonts w:ascii="Montserrat" w:eastAsia="Montserrat" w:hAnsi="Montserrat" w:cs="Montserrat"/>
+                                <w:color w:val="000000"/>
+                                <w:sz w:val="32"/>
+                              </w:rPr>
+                              <w:t>Cortés</w:t>
                             </w:r>
                             <w:r>
                               <w:rPr>
@@ -869,7 +891,14 @@
                           <w:sz w:val="32"/>
                         </w:rPr>
                         <w:br/>
-                        <w:t>Cristian Ariel Tesaglio</w:t>
+                      </w:r>
+                      <w:r>
+                        <w:rPr>
+                          <w:rFonts w:ascii="Montserrat" w:eastAsia="Montserrat" w:hAnsi="Montserrat" w:cs="Montserrat"/>
+                          <w:color w:val="000000"/>
+                          <w:sz w:val="32"/>
+                        </w:rPr>
+                        <w:t>Matías Hernán Ramírez</w:t>
                       </w:r>
                       <w:r>
                         <w:rPr>
@@ -878,7 +907,22 @@
                           <w:sz w:val="32"/>
                         </w:rPr>
                         <w:br/>
-                        <w:t>Martín Ignacio Torres</w:t>
+                      </w:r>
+                      <w:r>
+                        <w:rPr>
+                          <w:rFonts w:ascii="Montserrat" w:eastAsia="Montserrat" w:hAnsi="Montserrat" w:cs="Montserrat"/>
+                          <w:color w:val="000000"/>
+                          <w:sz w:val="32"/>
+                        </w:rPr>
+                        <w:t xml:space="preserve">Germán Gabriel </w:t>
+                      </w:r>
+                      <w:r>
+                        <w:rPr>
+                          <w:rFonts w:ascii="Montserrat" w:eastAsia="Montserrat" w:hAnsi="Montserrat" w:cs="Montserrat"/>
+                          <w:color w:val="000000"/>
+                          <w:sz w:val="32"/>
+                        </w:rPr>
+                        <w:t>Cortés</w:t>
                       </w:r>
                       <w:r>
                         <w:rPr>
@@ -1043,7 +1087,7 @@
     </w:p>
     <w:p>
       <w:pPr>
-        <w:pStyle w:val="Heading1"/>
+        <w:pStyle w:val="Ttulo1"/>
         <w:rPr>
           <w:rFonts w:ascii="Aptos" w:hAnsi="Aptos"/>
           <w:b/>
@@ -1145,7 +1189,7 @@
     </w:p>
     <w:p>
       <w:pPr>
-        <w:pStyle w:val="ListParagraph"/>
+        <w:pStyle w:val="Prrafodelista"/>
         <w:numPr>
           <w:ilvl w:val="0"/>
           <w:numId w:val="5"/>
@@ -1174,7 +1218,7 @@
     </w:p>
     <w:p>
       <w:pPr>
-        <w:pStyle w:val="ListParagraph"/>
+        <w:pStyle w:val="Prrafodelista"/>
         <w:numPr>
           <w:ilvl w:val="0"/>
           <w:numId w:val="5"/>
@@ -1203,7 +1247,7 @@
     </w:p>
     <w:p>
       <w:pPr>
-        <w:pStyle w:val="ListParagraph"/>
+        <w:pStyle w:val="Prrafodelista"/>
         <w:numPr>
           <w:ilvl w:val="0"/>
           <w:numId w:val="5"/>
@@ -1232,7 +1276,7 @@
     </w:p>
     <w:p>
       <w:pPr>
-        <w:pStyle w:val="ListParagraph"/>
+        <w:pStyle w:val="Prrafodelista"/>
         <w:numPr>
           <w:ilvl w:val="0"/>
           <w:numId w:val="5"/>
@@ -1261,7 +1305,7 @@
     </w:p>
     <w:p>
       <w:pPr>
-        <w:pStyle w:val="ListParagraph"/>
+        <w:pStyle w:val="Prrafodelista"/>
         <w:numPr>
           <w:ilvl w:val="0"/>
           <w:numId w:val="5"/>
@@ -1290,7 +1334,7 @@
     </w:p>
     <w:p>
       <w:pPr>
-        <w:pStyle w:val="ListParagraph"/>
+        <w:pStyle w:val="Prrafodelista"/>
         <w:numPr>
           <w:ilvl w:val="0"/>
           <w:numId w:val="5"/>
@@ -1385,7 +1429,7 @@
     </w:p>
     <w:p>
       <w:pPr>
-        <w:pStyle w:val="ListParagraph"/>
+        <w:pStyle w:val="Prrafodelista"/>
         <w:numPr>
           <w:ilvl w:val="0"/>
           <w:numId w:val="9"/>
@@ -1420,7 +1464,7 @@
     </w:p>
     <w:p>
       <w:pPr>
-        <w:pStyle w:val="ListParagraph"/>
+        <w:pStyle w:val="Prrafodelista"/>
         <w:numPr>
           <w:ilvl w:val="0"/>
           <w:numId w:val="9"/>
@@ -1441,7 +1485,7 @@
     </w:p>
     <w:p>
       <w:pPr>
-        <w:pStyle w:val="ListParagraph"/>
+        <w:pStyle w:val="Prrafodelista"/>
         <w:numPr>
           <w:ilvl w:val="0"/>
           <w:numId w:val="9"/>
@@ -1462,7 +1506,7 @@
     </w:p>
     <w:p>
       <w:pPr>
-        <w:pStyle w:val="ListParagraph"/>
+        <w:pStyle w:val="Prrafodelista"/>
         <w:numPr>
           <w:ilvl w:val="0"/>
           <w:numId w:val="9"/>
@@ -1550,7 +1594,7 @@
     </w:p>
     <w:p>
       <w:pPr>
-        <w:pStyle w:val="ListParagraph"/>
+        <w:pStyle w:val="Prrafodelista"/>
         <w:numPr>
           <w:ilvl w:val="0"/>
           <w:numId w:val="11"/>
@@ -1571,7 +1615,7 @@
     </w:p>
     <w:p>
       <w:pPr>
-        <w:pStyle w:val="ListParagraph"/>
+        <w:pStyle w:val="Prrafodelista"/>
         <w:numPr>
           <w:ilvl w:val="0"/>
           <w:numId w:val="11"/>
@@ -1592,7 +1636,7 @@
     </w:p>
     <w:p>
       <w:pPr>
-        <w:pStyle w:val="ListParagraph"/>
+        <w:pStyle w:val="Prrafodelista"/>
         <w:numPr>
           <w:ilvl w:val="0"/>
           <w:numId w:val="11"/>
@@ -1613,7 +1657,7 @@
     </w:p>
     <w:p>
       <w:pPr>
-        <w:pStyle w:val="ListParagraph"/>
+        <w:pStyle w:val="Prrafodelista"/>
         <w:numPr>
           <w:ilvl w:val="0"/>
           <w:numId w:val="11"/>
@@ -1634,7 +1678,7 @@
     </w:p>
     <w:p>
       <w:pPr>
-        <w:pStyle w:val="ListParagraph"/>
+        <w:pStyle w:val="Prrafodelista"/>
         <w:numPr>
           <w:ilvl w:val="0"/>
           <w:numId w:val="11"/>
@@ -1705,7 +1749,7 @@
 </file>
 
 <file path=word/numbering.xml><?xml version="1.0" encoding="utf-8"?>
-<w:numbering xmlns:wpc="http://schemas.microsoft.com/office/word/2010/wordprocessingCanvas" xmlns:cx="http://schemas.microsoft.com/office/drawing/2014/chartex" xmlns:cx1="http://schemas.microsoft.com/office/drawing/2015/9/8/chartex" xmlns:cx2="http://schemas.microsoft.com/office/drawing/2015/10/21/chartex" xmlns:cx3="http://schemas.microsoft.com/office/drawing/2016/5/9/chartex" xmlns:cx4="http://schemas.microsoft.com/office/drawing/2016/5/10/chartex" xmlns:cx5="http://schemas.microsoft.com/office/drawing/2016/5/11/chartex" xmlns:cx6="http://schemas.microsoft.com/office/drawing/2016/5/12/chartex" xmlns:cx7="http://schemas.microsoft.com/office/drawing/2016/5/13/chartex" xmlns:cx8="http://schemas.microsoft.com/office/drawing/2016/5/14/chartex" xmlns:mc="http://schemas.openxmlformats.org/markup-compatibility/2006" xmlns:aink="http://schemas.microsoft.com/office/drawing/2016/ink" xmlns:am3d="http://schemas.microsoft.com/office/drawing/2017/model3d" xmlns:o="urn:schemas-microsoft-com:office:office" xmlns:oel="http://schemas.microsoft.com/office/2019/extlst" xmlns:r="http://schemas.openxmlformats.org/officeDocument/2006/relationships" xmlns:m="http://schemas.openxmlformats.org/officeDocument/2006/math" xmlns:v="urn:schemas-microsoft-com:vml" xmlns:wp14="http://schemas.microsoft.com/office/word/2010/wordprocessingDrawing" xmlns:wp="http://schemas.openxmlformats.org/drawingml/2006/wordprocessingDrawing" xmlns:w10="urn:schemas-microsoft-com:office:word" xmlns:w="http://schemas.openxmlformats.org/wordprocessingml/2006/main" xmlns:w14="http://schemas.microsoft.com/office/word/2010/wordml" xmlns:w15="http://schemas.microsoft.com/office/word/2012/wordml" xmlns:w16cex="http://schemas.microsoft.com/office/word/2018/wordml/cex" xmlns:w16cid="http://schemas.microsoft.com/office/word/2016/wordml/cid" xmlns:w16="http://schemas.microsoft.com/office/word/2018/wordml" xmlns:w16du="http://schemas.microsoft.com/office/word/2023/wordml/word16du" xmlns:w16sdtdh="http://schemas.microsoft.com/office/word/2020/wordml/sdtdatahash" xmlns:w16sdtfl="http://schemas.microsoft.com/office/word/2024/wordml/sdtformatlock" xmlns:w16se="http://schemas.microsoft.com/office/word/2015/wordml/symex" xmlns:wpg="http://schemas.microsoft.com/office/word/2010/wordprocessingGroup" xmlns:wpi="http://schemas.microsoft.com/office/word/2010/wordprocessingInk" xmlns:wne="http://schemas.microsoft.com/office/word/2006/wordml" xmlns:wps="http://schemas.microsoft.com/office/word/2010/wordprocessingShape" mc:Ignorable="w14 w15 w16se w16cid w16 w16cex w16sdtdh w16sdtfl w16du wp14">
+<w:numbering xmlns:wpc="http://schemas.microsoft.com/office/word/2010/wordprocessingCanvas" xmlns:cx="http://schemas.microsoft.com/office/drawing/2014/chartex" xmlns:cx1="http://schemas.microsoft.com/office/drawing/2015/9/8/chartex" xmlns:cx2="http://schemas.microsoft.com/office/drawing/2015/10/21/chartex" xmlns:cx3="http://schemas.microsoft.com/office/drawing/2016/5/9/chartex" xmlns:cx4="http://schemas.microsoft.com/office/drawing/2016/5/10/chartex" xmlns:cx5="http://schemas.microsoft.com/office/drawing/2016/5/11/chartex" xmlns:cx6="http://schemas.microsoft.com/office/drawing/2016/5/12/chartex" xmlns:cx7="http://schemas.microsoft.com/office/drawing/2016/5/13/chartex" xmlns:cx8="http://schemas.microsoft.com/office/drawing/2016/5/14/chartex" xmlns:mc="http://schemas.openxmlformats.org/markup-compatibility/2006" xmlns:aink="http://schemas.microsoft.com/office/drawing/2016/ink" xmlns:am3d="http://schemas.microsoft.com/office/drawing/2017/model3d" xmlns:o="urn:schemas-microsoft-com:office:office" xmlns:r="http://schemas.openxmlformats.org/officeDocument/2006/relationships" xmlns:m="http://schemas.openxmlformats.org/officeDocument/2006/math" xmlns:v="urn:schemas-microsoft-com:vml" xmlns:wp14="http://schemas.microsoft.com/office/word/2010/wordprocessingDrawing" xmlns:wp="http://schemas.openxmlformats.org/drawingml/2006/wordprocessingDrawing" xmlns:w10="urn:schemas-microsoft-com:office:word" xmlns:w="http://schemas.openxmlformats.org/wordprocessingml/2006/main" xmlns:w14="http://schemas.microsoft.com/office/word/2010/wordml" xmlns:w15="http://schemas.microsoft.com/office/word/2012/wordml" xmlns:w16cex="http://schemas.microsoft.com/office/word/2018/wordml/cex" xmlns:w16cid="http://schemas.microsoft.com/office/word/2016/wordml/cid" xmlns:w16="http://schemas.microsoft.com/office/word/2018/wordml" xmlns:w16sdtdh="http://schemas.microsoft.com/office/word/2020/wordml/sdtdatahash" xmlns:w16se="http://schemas.microsoft.com/office/word/2015/wordml/symex" xmlns:wpg="http://schemas.microsoft.com/office/word/2010/wordprocessingGroup" xmlns:wpi="http://schemas.microsoft.com/office/word/2010/wordprocessingInk" xmlns:wne="http://schemas.microsoft.com/office/word/2006/wordml" xmlns:wps="http://schemas.microsoft.com/office/word/2010/wordprocessingShape" mc:Ignorable="w14 w15 w16se w16cid w16 w16cex w16sdtdh wp14">
   <w:abstractNum w:abstractNumId="0" w15:restartNumberingAfterBreak="0">
     <w:nsid w:val="03364FD0"/>
     <w:multiLevelType w:val="hybridMultilevel"/>
@@ -3009,44 +3053,44 @@
       </w:rPr>
     </w:lvl>
   </w:abstractNum>
-  <w:num w:numId="1" w16cid:durableId="234362881">
+  <w:num w:numId="1">
     <w:abstractNumId w:val="7"/>
   </w:num>
-  <w:num w:numId="2" w16cid:durableId="416247360">
+  <w:num w:numId="2">
     <w:abstractNumId w:val="3"/>
   </w:num>
-  <w:num w:numId="3" w16cid:durableId="698089956">
+  <w:num w:numId="3">
     <w:abstractNumId w:val="6"/>
   </w:num>
-  <w:num w:numId="4" w16cid:durableId="464203239">
+  <w:num w:numId="4">
     <w:abstractNumId w:val="2"/>
   </w:num>
-  <w:num w:numId="5" w16cid:durableId="1658532183">
+  <w:num w:numId="5">
     <w:abstractNumId w:val="0"/>
   </w:num>
-  <w:num w:numId="6" w16cid:durableId="1266424870">
+  <w:num w:numId="6">
     <w:abstractNumId w:val="1"/>
   </w:num>
-  <w:num w:numId="7" w16cid:durableId="2123719971">
+  <w:num w:numId="7">
     <w:abstractNumId w:val="4"/>
   </w:num>
-  <w:num w:numId="8" w16cid:durableId="1075738879">
+  <w:num w:numId="8">
     <w:abstractNumId w:val="5"/>
   </w:num>
-  <w:num w:numId="9" w16cid:durableId="1238511634">
+  <w:num w:numId="9">
     <w:abstractNumId w:val="9"/>
   </w:num>
-  <w:num w:numId="10" w16cid:durableId="1902324244">
+  <w:num w:numId="10">
     <w:abstractNumId w:val="8"/>
   </w:num>
-  <w:num w:numId="11" w16cid:durableId="367068426">
+  <w:num w:numId="11">
     <w:abstractNumId w:val="10"/>
   </w:num>
 </w:numbering>
 </file>
 
 <file path=word/styles.xml><?xml version="1.0" encoding="utf-8"?>
-<w:styles xmlns:mc="http://schemas.openxmlformats.org/markup-compatibility/2006" xmlns:r="http://schemas.openxmlformats.org/officeDocument/2006/relationships" xmlns:w="http://schemas.openxmlformats.org/wordprocessingml/2006/main" xmlns:w14="http://schemas.microsoft.com/office/word/2010/wordml" xmlns:w15="http://schemas.microsoft.com/office/word/2012/wordml" xmlns:w16cex="http://schemas.microsoft.com/office/word/2018/wordml/cex" xmlns:w16cid="http://schemas.microsoft.com/office/word/2016/wordml/cid" xmlns:w16="http://schemas.microsoft.com/office/word/2018/wordml" xmlns:w16du="http://schemas.microsoft.com/office/word/2023/wordml/word16du" xmlns:w16sdtdh="http://schemas.microsoft.com/office/word/2020/wordml/sdtdatahash" xmlns:w16sdtfl="http://schemas.microsoft.com/office/word/2024/wordml/sdtformatlock" xmlns:w16se="http://schemas.microsoft.com/office/word/2015/wordml/symex" mc:Ignorable="w14 w15 w16se w16cid w16 w16cex w16sdtdh w16sdtfl w16du">
+<w:styles xmlns:mc="http://schemas.openxmlformats.org/markup-compatibility/2006" xmlns:r="http://schemas.openxmlformats.org/officeDocument/2006/relationships" xmlns:w="http://schemas.openxmlformats.org/wordprocessingml/2006/main" xmlns:w14="http://schemas.microsoft.com/office/word/2010/wordml" xmlns:w15="http://schemas.microsoft.com/office/word/2012/wordml" xmlns:w16cex="http://schemas.microsoft.com/office/word/2018/wordml/cex" xmlns:w16cid="http://schemas.microsoft.com/office/word/2016/wordml/cid" xmlns:w16="http://schemas.microsoft.com/office/word/2018/wordml" xmlns:w16sdtdh="http://schemas.microsoft.com/office/word/2020/wordml/sdtdatahash" xmlns:w16se="http://schemas.microsoft.com/office/word/2015/wordml/symex" mc:Ignorable="w14 w15 w16se w16cid w16 w16cex w16sdtdh">
   <w:docDefaults>
     <w:rPrDefault>
       <w:rPr>
@@ -3446,7 +3490,7 @@
     <w:name w:val="Normal"/>
     <w:qFormat/>
   </w:style>
-  <w:style w:type="paragraph" w:styleId="Heading1">
+  <w:style w:type="paragraph" w:styleId="Ttulo1">
     <w:name w:val="heading 1"/>
     <w:basedOn w:val="Normal"/>
     <w:next w:val="Normal"/>
@@ -3465,7 +3509,7 @@
       <w:szCs w:val="32"/>
     </w:rPr>
   </w:style>
-  <w:style w:type="paragraph" w:styleId="Heading2">
+  <w:style w:type="paragraph" w:styleId="Ttulo2">
     <w:name w:val="heading 2"/>
     <w:basedOn w:val="Normal"/>
     <w:next w:val="Normal"/>
@@ -3486,7 +3530,7 @@
       <w:szCs w:val="36"/>
     </w:rPr>
   </w:style>
-  <w:style w:type="paragraph" w:styleId="Heading3">
+  <w:style w:type="paragraph" w:styleId="Ttulo3">
     <w:name w:val="heading 3"/>
     <w:basedOn w:val="Normal"/>
     <w:next w:val="Normal"/>
@@ -3507,7 +3551,7 @@
       <w:szCs w:val="24"/>
     </w:rPr>
   </w:style>
-  <w:style w:type="paragraph" w:styleId="Heading4">
+  <w:style w:type="paragraph" w:styleId="Ttulo4">
     <w:name w:val="heading 4"/>
     <w:basedOn w:val="Normal"/>
     <w:next w:val="Normal"/>
@@ -3528,7 +3572,7 @@
       <w:szCs w:val="24"/>
     </w:rPr>
   </w:style>
-  <w:style w:type="paragraph" w:styleId="Heading5">
+  <w:style w:type="paragraph" w:styleId="Ttulo5">
     <w:name w:val="heading 5"/>
     <w:basedOn w:val="Normal"/>
     <w:next w:val="Normal"/>
@@ -3549,7 +3593,7 @@
       <w:szCs w:val="22"/>
     </w:rPr>
   </w:style>
-  <w:style w:type="paragraph" w:styleId="Heading6">
+  <w:style w:type="paragraph" w:styleId="Ttulo6">
     <w:name w:val="heading 6"/>
     <w:basedOn w:val="Normal"/>
     <w:next w:val="Normal"/>
@@ -3570,12 +3614,13 @@
       <w:szCs w:val="20"/>
     </w:rPr>
   </w:style>
-  <w:style w:type="character" w:default="1" w:styleId="DefaultParagraphFont">
+  <w:style w:type="character" w:default="1" w:styleId="Fuentedeprrafopredeter">
     <w:name w:val="Default Paragraph Font"/>
     <w:uiPriority w:val="1"/>
+    <w:semiHidden/>
     <w:unhideWhenUsed/>
   </w:style>
-  <w:style w:type="table" w:default="1" w:styleId="TableNormal">
+  <w:style w:type="table" w:default="1" w:styleId="Tablanormal">
     <w:name w:val="Normal Table"/>
     <w:uiPriority w:val="99"/>
     <w:semiHidden/>
@@ -3590,13 +3635,13 @@
       </w:tblCellMar>
     </w:tblPr>
   </w:style>
-  <w:style w:type="numbering" w:default="1" w:styleId="NoList">
+  <w:style w:type="numbering" w:default="1" w:styleId="Sinlista">
     <w:name w:val="No List"/>
     <w:uiPriority w:val="99"/>
     <w:semiHidden/>
     <w:unhideWhenUsed/>
   </w:style>
-  <w:style w:type="table" w:customStyle="1" w:styleId="TableNormal0">
+  <w:style w:type="table" w:customStyle="1" w:styleId="TableNormal">
     <w:name w:val="TableNormal"/>
     <w:tblPr>
       <w:tblCellMar>
@@ -3607,7 +3652,7 @@
       </w:tblCellMar>
     </w:tblPr>
   </w:style>
-  <w:style w:type="paragraph" w:styleId="Title">
+  <w:style w:type="paragraph" w:styleId="Ttulo">
     <w:name w:val="Title"/>
     <w:basedOn w:val="Normal"/>
     <w:next w:val="Normal"/>
@@ -3623,7 +3668,7 @@
       <w:szCs w:val="56"/>
     </w:rPr>
   </w:style>
-  <w:style w:type="paragraph" w:styleId="Subtitle">
+  <w:style w:type="paragraph" w:styleId="Subttulo">
     <w:name w:val="Subtitle"/>
     <w:basedOn w:val="Normal"/>
     <w:next w:val="Normal"/>
@@ -3640,7 +3685,7 @@
     </w:rPr>
   </w:style>
   <w:style w:type="table" w:customStyle="1" w:styleId="a">
-    <w:basedOn w:val="TableNormal0"/>
+    <w:basedOn w:val="TableNormal"/>
     <w:tblPr>
       <w:tblStyleRowBandSize w:val="1"/>
       <w:tblStyleColBandSize w:val="1"/>
@@ -3652,7 +3697,7 @@
       </w:tblCellMar>
     </w:tblPr>
   </w:style>
-  <w:style w:type="paragraph" w:styleId="ListParagraph">
+  <w:style w:type="paragraph" w:styleId="Prrafodelista">
     <w:name w:val="List Paragraph"/>
     <w:basedOn w:val="Normal"/>
     <w:uiPriority w:val="34"/>

</xml_diff>

<commit_message>
Actualizo Word y scripts agregue trigger trg_AuditoriaPrecio
</commit_message>
<xml_diff>
--- a/documentacion/TPI_BaseDeDatosII_Grupo15.docx
+++ b/documentacion/TPI_BaseDeDatosII_Grupo15.docx
@@ -5203,8 +5203,1025 @@
           <w:szCs w:val="26"/>
           <w:lang w:val="es-419"/>
         </w:rPr>
+        <w:lastRenderedPageBreak/>
         <w:t>Trigger 1</w:t>
       </w:r>
+    </w:p>
+    <w:p>
+      <w:pPr>
+        <w:keepNext/>
+        <w:keepLines/>
+        <w:spacing w:before="280" w:after="80" w:line="360" w:lineRule="auto"/>
+        <w:ind w:left="0" w:right="0" w:firstLine="0"/>
+        <w:jc w:val="left"/>
+        <w:outlineLvl w:val="2"/>
+        <w:rPr>
+          <w:rFonts w:ascii="Aptos" w:hAnsi="Aptos"/>
+        </w:rPr>
+      </w:pPr>
+      <w:r>
+        <w:rPr>
+          <w:rFonts w:ascii="Aptos" w:hAnsi="Aptos"/>
+        </w:rPr>
+        <w:t>Se implementó un trigger de auditoría en la tabla Producto que se dispara automáticamente después de una actualización. El objetivo es registrar en la tabla AuditoriaPrecio cualquier modificación en el precio de venta de un producto. De esta manera, se conserva un historial con el precio anterior, el nuevo precio y la fecha del cambio, lo que permite garantizar la trazabilidad de las modificaciones realizadas.</w:t>
+      </w:r>
+    </w:p>
+    <w:p>
+      <w:pPr>
+        <w:keepNext/>
+        <w:keepLines/>
+        <w:spacing w:before="280" w:after="80" w:line="360" w:lineRule="auto"/>
+        <w:ind w:left="0" w:right="0" w:firstLine="0"/>
+        <w:jc w:val="left"/>
+        <w:outlineLvl w:val="2"/>
+        <w:rPr>
+          <w:rFonts w:ascii="Roboto" w:hAnsi="Roboto"/>
+        </w:rPr>
+      </w:pPr>
+    </w:p>
+    <w:p>
+      <w:pPr>
+        <w:keepNext/>
+        <w:keepLines/>
+        <w:spacing w:before="280" w:after="80" w:line="360" w:lineRule="auto"/>
+        <w:ind w:left="0" w:right="0" w:firstLine="0"/>
+        <w:jc w:val="left"/>
+        <w:outlineLvl w:val="2"/>
+        <w:rPr>
+          <w:rFonts w:ascii="Roboto" w:hAnsi="Roboto"/>
+        </w:rPr>
+      </w:pPr>
+    </w:p>
+    <w:p>
+      <w:pPr>
+        <w:keepNext/>
+        <w:keepLines/>
+        <w:spacing w:before="280" w:after="80" w:line="360" w:lineRule="auto"/>
+        <w:ind w:left="0" w:right="0" w:firstLine="0"/>
+        <w:jc w:val="left"/>
+        <w:outlineLvl w:val="2"/>
+        <w:rPr>
+          <w:rFonts w:ascii="Roboto" w:eastAsia="Roboto" w:hAnsi="Roboto" w:cs="Roboto"/>
+          <w:b/>
+          <w:bCs/>
+          <w:sz w:val="26"/>
+          <w:szCs w:val="26"/>
+          <w:lang w:val="es-419"/>
+        </w:rPr>
+      </w:pPr>
+    </w:p>
+    <w:tbl>
+      <w:tblPr>
+        <w:tblStyle w:val="TableGrid"/>
+        <w:tblW w:w="0" w:type="auto"/>
+        <w:tblLook w:val="04A0" w:firstRow="1" w:lastRow="0" w:firstColumn="1" w:lastColumn="0" w:noHBand="0" w:noVBand="1"/>
+      </w:tblPr>
+      <w:tblGrid>
+        <w:gridCol w:w="8494"/>
+      </w:tblGrid>
+      <w:tr>
+        <w:tc>
+          <w:tcPr>
+            <w:tcW w:w="8494" w:type="dxa"/>
+          </w:tcPr>
+          <w:p>
+            <w:pPr>
+              <w:autoSpaceDE w:val="0"/>
+              <w:autoSpaceDN w:val="0"/>
+              <w:adjustRightInd w:val="0"/>
+              <w:ind w:left="0" w:right="0" w:firstLine="0"/>
+              <w:jc w:val="left"/>
+              <w:rPr>
+                <w:rFonts w:ascii="Cascadia Mono" w:hAnsi="Cascadia Mono" w:cs="Cascadia Mono"/>
+                <w:color w:val="000000"/>
+                <w:sz w:val="19"/>
+                <w:szCs w:val="19"/>
+                <w:highlight w:val="white"/>
+                <w:lang w:val="en-US"/>
+              </w:rPr>
+            </w:pPr>
+            <w:r>
+              <w:rPr>
+                <w:rFonts w:ascii="Cascadia Mono" w:hAnsi="Cascadia Mono" w:cs="Cascadia Mono"/>
+                <w:color w:val="0000FF"/>
+                <w:sz w:val="19"/>
+                <w:szCs w:val="19"/>
+                <w:highlight w:val="white"/>
+                <w:lang w:val="en-US"/>
+              </w:rPr>
+              <w:t>CREATE</w:t>
+            </w:r>
+            <w:r>
+              <w:rPr>
+                <w:rFonts w:ascii="Cascadia Mono" w:hAnsi="Cascadia Mono" w:cs="Cascadia Mono"/>
+                <w:color w:val="000000"/>
+                <w:sz w:val="19"/>
+                <w:szCs w:val="19"/>
+                <w:highlight w:val="white"/>
+                <w:lang w:val="en-US"/>
+              </w:rPr>
+              <w:t xml:space="preserve"> </w:t>
+            </w:r>
+            <w:r>
+              <w:rPr>
+                <w:rFonts w:ascii="Cascadia Mono" w:hAnsi="Cascadia Mono" w:cs="Cascadia Mono"/>
+                <w:color w:val="0000FF"/>
+                <w:sz w:val="19"/>
+                <w:szCs w:val="19"/>
+                <w:highlight w:val="white"/>
+                <w:lang w:val="en-US"/>
+              </w:rPr>
+              <w:t>TRIGGER</w:t>
+            </w:r>
+            <w:r>
+              <w:rPr>
+                <w:rFonts w:ascii="Cascadia Mono" w:hAnsi="Cascadia Mono" w:cs="Cascadia Mono"/>
+                <w:color w:val="000000"/>
+                <w:sz w:val="19"/>
+                <w:szCs w:val="19"/>
+                <w:highlight w:val="white"/>
+                <w:lang w:val="en-US"/>
+              </w:rPr>
+              <w:t xml:space="preserve"> trg_AuditoriaPrecio</w:t>
+            </w:r>
+          </w:p>
+          <w:p>
+            <w:pPr>
+              <w:autoSpaceDE w:val="0"/>
+              <w:autoSpaceDN w:val="0"/>
+              <w:adjustRightInd w:val="0"/>
+              <w:ind w:left="0" w:right="0" w:firstLine="0"/>
+              <w:jc w:val="left"/>
+              <w:rPr>
+                <w:rFonts w:ascii="Cascadia Mono" w:hAnsi="Cascadia Mono" w:cs="Cascadia Mono"/>
+                <w:color w:val="000000"/>
+                <w:sz w:val="19"/>
+                <w:szCs w:val="19"/>
+                <w:highlight w:val="white"/>
+                <w:lang w:val="en-US"/>
+              </w:rPr>
+            </w:pPr>
+            <w:r>
+              <w:rPr>
+                <w:rFonts w:ascii="Cascadia Mono" w:hAnsi="Cascadia Mono" w:cs="Cascadia Mono"/>
+                <w:color w:val="0000FF"/>
+                <w:sz w:val="19"/>
+                <w:szCs w:val="19"/>
+                <w:highlight w:val="white"/>
+                <w:lang w:val="en-US"/>
+              </w:rPr>
+              <w:t>ON</w:t>
+            </w:r>
+            <w:r>
+              <w:rPr>
+                <w:rFonts w:ascii="Cascadia Mono" w:hAnsi="Cascadia Mono" w:cs="Cascadia Mono"/>
+                <w:color w:val="000000"/>
+                <w:sz w:val="19"/>
+                <w:szCs w:val="19"/>
+                <w:highlight w:val="white"/>
+                <w:lang w:val="en-US"/>
+              </w:rPr>
+              <w:t xml:space="preserve"> Producto</w:t>
+            </w:r>
+          </w:p>
+          <w:p>
+            <w:pPr>
+              <w:autoSpaceDE w:val="0"/>
+              <w:autoSpaceDN w:val="0"/>
+              <w:adjustRightInd w:val="0"/>
+              <w:ind w:left="0" w:right="0" w:firstLine="0"/>
+              <w:jc w:val="left"/>
+              <w:rPr>
+                <w:rFonts w:ascii="Cascadia Mono" w:hAnsi="Cascadia Mono" w:cs="Cascadia Mono"/>
+                <w:color w:val="000000"/>
+                <w:sz w:val="19"/>
+                <w:szCs w:val="19"/>
+                <w:highlight w:val="white"/>
+              </w:rPr>
+            </w:pPr>
+            <w:r>
+              <w:rPr>
+                <w:rFonts w:ascii="Cascadia Mono" w:hAnsi="Cascadia Mono" w:cs="Cascadia Mono"/>
+                <w:color w:val="0000FF"/>
+                <w:sz w:val="19"/>
+                <w:szCs w:val="19"/>
+                <w:highlight w:val="white"/>
+              </w:rPr>
+              <w:t>AFTER</w:t>
+            </w:r>
+            <w:r>
+              <w:rPr>
+                <w:rFonts w:ascii="Cascadia Mono" w:hAnsi="Cascadia Mono" w:cs="Cascadia Mono"/>
+                <w:color w:val="000000"/>
+                <w:sz w:val="19"/>
+                <w:szCs w:val="19"/>
+                <w:highlight w:val="white"/>
+              </w:rPr>
+              <w:t xml:space="preserve"> </w:t>
+            </w:r>
+            <w:r>
+              <w:rPr>
+                <w:rFonts w:ascii="Cascadia Mono" w:hAnsi="Cascadia Mono" w:cs="Cascadia Mono"/>
+                <w:color w:val="FF00FF"/>
+                <w:sz w:val="19"/>
+                <w:szCs w:val="19"/>
+                <w:highlight w:val="white"/>
+              </w:rPr>
+              <w:t>UPDATE</w:t>
+            </w:r>
+          </w:p>
+          <w:p>
+            <w:pPr>
+              <w:autoSpaceDE w:val="0"/>
+              <w:autoSpaceDN w:val="0"/>
+              <w:adjustRightInd w:val="0"/>
+              <w:ind w:left="0" w:right="0" w:firstLine="0"/>
+              <w:jc w:val="left"/>
+              <w:rPr>
+                <w:rFonts w:ascii="Cascadia Mono" w:hAnsi="Cascadia Mono" w:cs="Cascadia Mono"/>
+                <w:color w:val="000000"/>
+                <w:sz w:val="19"/>
+                <w:szCs w:val="19"/>
+                <w:highlight w:val="white"/>
+              </w:rPr>
+            </w:pPr>
+            <w:r>
+              <w:rPr>
+                <w:rFonts w:ascii="Cascadia Mono" w:hAnsi="Cascadia Mono" w:cs="Cascadia Mono"/>
+                <w:color w:val="0000FF"/>
+                <w:sz w:val="19"/>
+                <w:szCs w:val="19"/>
+                <w:highlight w:val="white"/>
+              </w:rPr>
+              <w:t>AS</w:t>
+            </w:r>
+          </w:p>
+          <w:p>
+            <w:pPr>
+              <w:autoSpaceDE w:val="0"/>
+              <w:autoSpaceDN w:val="0"/>
+              <w:adjustRightInd w:val="0"/>
+              <w:ind w:left="0" w:right="0" w:firstLine="0"/>
+              <w:jc w:val="left"/>
+              <w:rPr>
+                <w:rFonts w:ascii="Cascadia Mono" w:hAnsi="Cascadia Mono" w:cs="Cascadia Mono"/>
+                <w:color w:val="000000"/>
+                <w:sz w:val="19"/>
+                <w:szCs w:val="19"/>
+                <w:highlight w:val="white"/>
+              </w:rPr>
+            </w:pPr>
+            <w:r>
+              <w:rPr>
+                <w:rFonts w:ascii="Cascadia Mono" w:hAnsi="Cascadia Mono" w:cs="Cascadia Mono"/>
+                <w:color w:val="0000FF"/>
+                <w:sz w:val="19"/>
+                <w:szCs w:val="19"/>
+                <w:highlight w:val="white"/>
+              </w:rPr>
+              <w:t>BEGIN</w:t>
+            </w:r>
+          </w:p>
+          <w:p>
+            <w:pPr>
+              <w:autoSpaceDE w:val="0"/>
+              <w:autoSpaceDN w:val="0"/>
+              <w:adjustRightInd w:val="0"/>
+              <w:ind w:left="0" w:right="0" w:firstLine="0"/>
+              <w:jc w:val="left"/>
+              <w:rPr>
+                <w:rFonts w:ascii="Cascadia Mono" w:hAnsi="Cascadia Mono" w:cs="Cascadia Mono"/>
+                <w:color w:val="000000"/>
+                <w:sz w:val="19"/>
+                <w:szCs w:val="19"/>
+                <w:highlight w:val="white"/>
+              </w:rPr>
+            </w:pPr>
+            <w:r>
+              <w:rPr>
+                <w:rFonts w:ascii="Cascadia Mono" w:hAnsi="Cascadia Mono" w:cs="Cascadia Mono"/>
+                <w:color w:val="000000"/>
+                <w:sz w:val="19"/>
+                <w:szCs w:val="19"/>
+                <w:highlight w:val="white"/>
+              </w:rPr>
+              <w:t xml:space="preserve">    </w:t>
+            </w:r>
+            <w:r>
+              <w:rPr>
+                <w:rFonts w:ascii="Cascadia Mono" w:hAnsi="Cascadia Mono" w:cs="Cascadia Mono"/>
+                <w:color w:val="0000FF"/>
+                <w:sz w:val="19"/>
+                <w:szCs w:val="19"/>
+                <w:highlight w:val="white"/>
+              </w:rPr>
+              <w:t>INSERT</w:t>
+            </w:r>
+            <w:r>
+              <w:rPr>
+                <w:rFonts w:ascii="Cascadia Mono" w:hAnsi="Cascadia Mono" w:cs="Cascadia Mono"/>
+                <w:color w:val="000000"/>
+                <w:sz w:val="19"/>
+                <w:szCs w:val="19"/>
+                <w:highlight w:val="white"/>
+              </w:rPr>
+              <w:t xml:space="preserve"> </w:t>
+            </w:r>
+            <w:r>
+              <w:rPr>
+                <w:rFonts w:ascii="Cascadia Mono" w:hAnsi="Cascadia Mono" w:cs="Cascadia Mono"/>
+                <w:color w:val="0000FF"/>
+                <w:sz w:val="19"/>
+                <w:szCs w:val="19"/>
+                <w:highlight w:val="white"/>
+              </w:rPr>
+              <w:t>INTO</w:t>
+            </w:r>
+            <w:r>
+              <w:rPr>
+                <w:rFonts w:ascii="Cascadia Mono" w:hAnsi="Cascadia Mono" w:cs="Cascadia Mono"/>
+                <w:color w:val="000000"/>
+                <w:sz w:val="19"/>
+                <w:szCs w:val="19"/>
+                <w:highlight w:val="white"/>
+              </w:rPr>
+              <w:t xml:space="preserve"> AuditoriaPrecio</w:t>
+            </w:r>
+            <w:r>
+              <w:rPr>
+                <w:rFonts w:ascii="Cascadia Mono" w:hAnsi="Cascadia Mono" w:cs="Cascadia Mono"/>
+                <w:color w:val="0000FF"/>
+                <w:sz w:val="19"/>
+                <w:szCs w:val="19"/>
+                <w:highlight w:val="white"/>
+              </w:rPr>
+              <w:t xml:space="preserve"> </w:t>
+            </w:r>
+            <w:r>
+              <w:rPr>
+                <w:rFonts w:ascii="Cascadia Mono" w:hAnsi="Cascadia Mono" w:cs="Cascadia Mono"/>
+                <w:color w:val="808080"/>
+                <w:sz w:val="19"/>
+                <w:szCs w:val="19"/>
+                <w:highlight w:val="white"/>
+              </w:rPr>
+              <w:t>(</w:t>
+            </w:r>
+            <w:r>
+              <w:rPr>
+                <w:rFonts w:ascii="Cascadia Mono" w:hAnsi="Cascadia Mono" w:cs="Cascadia Mono"/>
+                <w:color w:val="000000"/>
+                <w:sz w:val="19"/>
+                <w:szCs w:val="19"/>
+                <w:highlight w:val="white"/>
+              </w:rPr>
+              <w:t>IDProducto</w:t>
+            </w:r>
+            <w:r>
+              <w:rPr>
+                <w:rFonts w:ascii="Cascadia Mono" w:hAnsi="Cascadia Mono" w:cs="Cascadia Mono"/>
+                <w:color w:val="808080"/>
+                <w:sz w:val="19"/>
+                <w:szCs w:val="19"/>
+                <w:highlight w:val="white"/>
+              </w:rPr>
+              <w:t>,</w:t>
+            </w:r>
+            <w:r>
+              <w:rPr>
+                <w:rFonts w:ascii="Cascadia Mono" w:hAnsi="Cascadia Mono" w:cs="Cascadia Mono"/>
+                <w:color w:val="000000"/>
+                <w:sz w:val="19"/>
+                <w:szCs w:val="19"/>
+                <w:highlight w:val="white"/>
+              </w:rPr>
+              <w:t xml:space="preserve"> PrecioAnterior</w:t>
+            </w:r>
+            <w:r>
+              <w:rPr>
+                <w:rFonts w:ascii="Cascadia Mono" w:hAnsi="Cascadia Mono" w:cs="Cascadia Mono"/>
+                <w:color w:val="808080"/>
+                <w:sz w:val="19"/>
+                <w:szCs w:val="19"/>
+                <w:highlight w:val="white"/>
+              </w:rPr>
+              <w:t>,</w:t>
+            </w:r>
+            <w:r>
+              <w:rPr>
+                <w:rFonts w:ascii="Cascadia Mono" w:hAnsi="Cascadia Mono" w:cs="Cascadia Mono"/>
+                <w:color w:val="000000"/>
+                <w:sz w:val="19"/>
+                <w:szCs w:val="19"/>
+                <w:highlight w:val="white"/>
+              </w:rPr>
+              <w:t xml:space="preserve"> PrecioNuevo</w:t>
+            </w:r>
+            <w:r>
+              <w:rPr>
+                <w:rFonts w:ascii="Cascadia Mono" w:hAnsi="Cascadia Mono" w:cs="Cascadia Mono"/>
+                <w:color w:val="808080"/>
+                <w:sz w:val="19"/>
+                <w:szCs w:val="19"/>
+                <w:highlight w:val="white"/>
+              </w:rPr>
+              <w:t>,</w:t>
+            </w:r>
+            <w:r>
+              <w:rPr>
+                <w:rFonts w:ascii="Cascadia Mono" w:hAnsi="Cascadia Mono" w:cs="Cascadia Mono"/>
+                <w:color w:val="000000"/>
+                <w:sz w:val="19"/>
+                <w:szCs w:val="19"/>
+                <w:highlight w:val="white"/>
+              </w:rPr>
+              <w:t xml:space="preserve"> FechaCambio</w:t>
+            </w:r>
+            <w:r>
+              <w:rPr>
+                <w:rFonts w:ascii="Cascadia Mono" w:hAnsi="Cascadia Mono" w:cs="Cascadia Mono"/>
+                <w:color w:val="808080"/>
+                <w:sz w:val="19"/>
+                <w:szCs w:val="19"/>
+                <w:highlight w:val="white"/>
+              </w:rPr>
+              <w:t>)</w:t>
+            </w:r>
+          </w:p>
+          <w:p>
+            <w:pPr>
+              <w:autoSpaceDE w:val="0"/>
+              <w:autoSpaceDN w:val="0"/>
+              <w:adjustRightInd w:val="0"/>
+              <w:ind w:left="0" w:right="0" w:firstLine="0"/>
+              <w:jc w:val="left"/>
+              <w:rPr>
+                <w:rFonts w:ascii="Cascadia Mono" w:hAnsi="Cascadia Mono" w:cs="Cascadia Mono"/>
+                <w:color w:val="000000"/>
+                <w:sz w:val="19"/>
+                <w:szCs w:val="19"/>
+                <w:highlight w:val="white"/>
+              </w:rPr>
+            </w:pPr>
+            <w:r>
+              <w:rPr>
+                <w:rFonts w:ascii="Cascadia Mono" w:hAnsi="Cascadia Mono" w:cs="Cascadia Mono"/>
+                <w:color w:val="000000"/>
+                <w:sz w:val="19"/>
+                <w:szCs w:val="19"/>
+                <w:highlight w:val="white"/>
+              </w:rPr>
+              <w:t xml:space="preserve">    </w:t>
+            </w:r>
+            <w:r>
+              <w:rPr>
+                <w:rFonts w:ascii="Cascadia Mono" w:hAnsi="Cascadia Mono" w:cs="Cascadia Mono"/>
+                <w:color w:val="0000FF"/>
+                <w:sz w:val="19"/>
+                <w:szCs w:val="19"/>
+                <w:highlight w:val="white"/>
+              </w:rPr>
+              <w:t>SELECT</w:t>
+            </w:r>
+            <w:r>
+              <w:rPr>
+                <w:rFonts w:ascii="Cascadia Mono" w:hAnsi="Cascadia Mono" w:cs="Cascadia Mono"/>
+                <w:color w:val="000000"/>
+                <w:sz w:val="19"/>
+                <w:szCs w:val="19"/>
+                <w:highlight w:val="white"/>
+              </w:rPr>
+              <w:t xml:space="preserve"> d</w:t>
+            </w:r>
+            <w:r>
+              <w:rPr>
+                <w:rFonts w:ascii="Cascadia Mono" w:hAnsi="Cascadia Mono" w:cs="Cascadia Mono"/>
+                <w:color w:val="808080"/>
+                <w:sz w:val="19"/>
+                <w:szCs w:val="19"/>
+                <w:highlight w:val="white"/>
+              </w:rPr>
+              <w:t>.</w:t>
+            </w:r>
+            <w:r>
+              <w:rPr>
+                <w:rFonts w:ascii="Cascadia Mono" w:hAnsi="Cascadia Mono" w:cs="Cascadia Mono"/>
+                <w:color w:val="000000"/>
+                <w:sz w:val="19"/>
+                <w:szCs w:val="19"/>
+                <w:highlight w:val="white"/>
+              </w:rPr>
+              <w:t>IDProducto</w:t>
+            </w:r>
+            <w:r>
+              <w:rPr>
+                <w:rFonts w:ascii="Cascadia Mono" w:hAnsi="Cascadia Mono" w:cs="Cascadia Mono"/>
+                <w:color w:val="808080"/>
+                <w:sz w:val="19"/>
+                <w:szCs w:val="19"/>
+                <w:highlight w:val="white"/>
+              </w:rPr>
+              <w:t>,</w:t>
+            </w:r>
+            <w:r>
+              <w:rPr>
+                <w:rFonts w:ascii="Cascadia Mono" w:hAnsi="Cascadia Mono" w:cs="Cascadia Mono"/>
+                <w:color w:val="000000"/>
+                <w:sz w:val="19"/>
+                <w:szCs w:val="19"/>
+                <w:highlight w:val="white"/>
+              </w:rPr>
+              <w:t xml:space="preserve"> d</w:t>
+            </w:r>
+            <w:r>
+              <w:rPr>
+                <w:rFonts w:ascii="Cascadia Mono" w:hAnsi="Cascadia Mono" w:cs="Cascadia Mono"/>
+                <w:color w:val="808080"/>
+                <w:sz w:val="19"/>
+                <w:szCs w:val="19"/>
+                <w:highlight w:val="white"/>
+              </w:rPr>
+              <w:t>.</w:t>
+            </w:r>
+            <w:r>
+              <w:rPr>
+                <w:rFonts w:ascii="Cascadia Mono" w:hAnsi="Cascadia Mono" w:cs="Cascadia Mono"/>
+                <w:color w:val="000000"/>
+                <w:sz w:val="19"/>
+                <w:szCs w:val="19"/>
+                <w:highlight w:val="white"/>
+              </w:rPr>
+              <w:t>PrecioVenta</w:t>
+            </w:r>
+            <w:r>
+              <w:rPr>
+                <w:rFonts w:ascii="Cascadia Mono" w:hAnsi="Cascadia Mono" w:cs="Cascadia Mono"/>
+                <w:color w:val="808080"/>
+                <w:sz w:val="19"/>
+                <w:szCs w:val="19"/>
+                <w:highlight w:val="white"/>
+              </w:rPr>
+              <w:t>,</w:t>
+            </w:r>
+            <w:r>
+              <w:rPr>
+                <w:rFonts w:ascii="Cascadia Mono" w:hAnsi="Cascadia Mono" w:cs="Cascadia Mono"/>
+                <w:color w:val="000000"/>
+                <w:sz w:val="19"/>
+                <w:szCs w:val="19"/>
+                <w:highlight w:val="white"/>
+              </w:rPr>
+              <w:t xml:space="preserve"> i</w:t>
+            </w:r>
+            <w:r>
+              <w:rPr>
+                <w:rFonts w:ascii="Cascadia Mono" w:hAnsi="Cascadia Mono" w:cs="Cascadia Mono"/>
+                <w:color w:val="808080"/>
+                <w:sz w:val="19"/>
+                <w:szCs w:val="19"/>
+                <w:highlight w:val="white"/>
+              </w:rPr>
+              <w:t>.</w:t>
+            </w:r>
+            <w:r>
+              <w:rPr>
+                <w:rFonts w:ascii="Cascadia Mono" w:hAnsi="Cascadia Mono" w:cs="Cascadia Mono"/>
+                <w:color w:val="000000"/>
+                <w:sz w:val="19"/>
+                <w:szCs w:val="19"/>
+                <w:highlight w:val="white"/>
+              </w:rPr>
+              <w:t>PrecioVenta</w:t>
+            </w:r>
+            <w:r>
+              <w:rPr>
+                <w:rFonts w:ascii="Cascadia Mono" w:hAnsi="Cascadia Mono" w:cs="Cascadia Mono"/>
+                <w:color w:val="808080"/>
+                <w:sz w:val="19"/>
+                <w:szCs w:val="19"/>
+                <w:highlight w:val="white"/>
+              </w:rPr>
+              <w:t>,</w:t>
+            </w:r>
+            <w:r>
+              <w:rPr>
+                <w:rFonts w:ascii="Cascadia Mono" w:hAnsi="Cascadia Mono" w:cs="Cascadia Mono"/>
+                <w:color w:val="000000"/>
+                <w:sz w:val="19"/>
+                <w:szCs w:val="19"/>
+                <w:highlight w:val="white"/>
+              </w:rPr>
+              <w:t xml:space="preserve"> </w:t>
+            </w:r>
+            <w:r>
+              <w:rPr>
+                <w:rFonts w:ascii="Cascadia Mono" w:hAnsi="Cascadia Mono" w:cs="Cascadia Mono"/>
+                <w:color w:val="FF00FF"/>
+                <w:sz w:val="19"/>
+                <w:szCs w:val="19"/>
+                <w:highlight w:val="white"/>
+              </w:rPr>
+              <w:t>GETDATE</w:t>
+            </w:r>
+            <w:r>
+              <w:rPr>
+                <w:rFonts w:ascii="Cascadia Mono" w:hAnsi="Cascadia Mono" w:cs="Cascadia Mono"/>
+                <w:color w:val="808080"/>
+                <w:sz w:val="19"/>
+                <w:szCs w:val="19"/>
+                <w:highlight w:val="white"/>
+              </w:rPr>
+              <w:t>()</w:t>
+            </w:r>
+          </w:p>
+          <w:p>
+            <w:pPr>
+              <w:autoSpaceDE w:val="0"/>
+              <w:autoSpaceDN w:val="0"/>
+              <w:adjustRightInd w:val="0"/>
+              <w:ind w:left="0" w:right="0" w:firstLine="0"/>
+              <w:jc w:val="left"/>
+              <w:rPr>
+                <w:rFonts w:ascii="Cascadia Mono" w:hAnsi="Cascadia Mono" w:cs="Cascadia Mono"/>
+                <w:color w:val="000000"/>
+                <w:sz w:val="19"/>
+                <w:szCs w:val="19"/>
+                <w:highlight w:val="white"/>
+                <w:lang w:val="en-US"/>
+              </w:rPr>
+            </w:pPr>
+            <w:r>
+              <w:rPr>
+                <w:rFonts w:ascii="Cascadia Mono" w:hAnsi="Cascadia Mono" w:cs="Cascadia Mono"/>
+                <w:color w:val="000000"/>
+                <w:sz w:val="19"/>
+                <w:szCs w:val="19"/>
+                <w:highlight w:val="white"/>
+              </w:rPr>
+              <w:t xml:space="preserve">    </w:t>
+            </w:r>
+            <w:r>
+              <w:rPr>
+                <w:rFonts w:ascii="Cascadia Mono" w:hAnsi="Cascadia Mono" w:cs="Cascadia Mono"/>
+                <w:color w:val="0000FF"/>
+                <w:sz w:val="19"/>
+                <w:szCs w:val="19"/>
+                <w:highlight w:val="white"/>
+                <w:lang w:val="en-US"/>
+              </w:rPr>
+              <w:t>FROM</w:t>
+            </w:r>
+            <w:r>
+              <w:rPr>
+                <w:rFonts w:ascii="Cascadia Mono" w:hAnsi="Cascadia Mono" w:cs="Cascadia Mono"/>
+                <w:color w:val="000000"/>
+                <w:sz w:val="19"/>
+                <w:szCs w:val="19"/>
+                <w:highlight w:val="white"/>
+                <w:lang w:val="en-US"/>
+              </w:rPr>
+              <w:t xml:space="preserve"> deleted d</w:t>
+            </w:r>
+          </w:p>
+          <w:p>
+            <w:pPr>
+              <w:autoSpaceDE w:val="0"/>
+              <w:autoSpaceDN w:val="0"/>
+              <w:adjustRightInd w:val="0"/>
+              <w:ind w:left="0" w:right="0" w:firstLine="0"/>
+              <w:jc w:val="left"/>
+              <w:rPr>
+                <w:rFonts w:ascii="Cascadia Mono" w:hAnsi="Cascadia Mono" w:cs="Cascadia Mono"/>
+                <w:color w:val="000000"/>
+                <w:sz w:val="19"/>
+                <w:szCs w:val="19"/>
+                <w:highlight w:val="white"/>
+                <w:lang w:val="en-US"/>
+              </w:rPr>
+            </w:pPr>
+            <w:r>
+              <w:rPr>
+                <w:rFonts w:ascii="Cascadia Mono" w:hAnsi="Cascadia Mono" w:cs="Cascadia Mono"/>
+                <w:color w:val="000000"/>
+                <w:sz w:val="19"/>
+                <w:szCs w:val="19"/>
+                <w:highlight w:val="white"/>
+                <w:lang w:val="en-US"/>
+              </w:rPr>
+              <w:t xml:space="preserve">    </w:t>
+            </w:r>
+            <w:r>
+              <w:rPr>
+                <w:rFonts w:ascii="Cascadia Mono" w:hAnsi="Cascadia Mono" w:cs="Cascadia Mono"/>
+                <w:color w:val="808080"/>
+                <w:sz w:val="19"/>
+                <w:szCs w:val="19"/>
+                <w:highlight w:val="white"/>
+                <w:lang w:val="en-US"/>
+              </w:rPr>
+              <w:t>JOIN</w:t>
+            </w:r>
+            <w:r>
+              <w:rPr>
+                <w:rFonts w:ascii="Cascadia Mono" w:hAnsi="Cascadia Mono" w:cs="Cascadia Mono"/>
+                <w:color w:val="000000"/>
+                <w:sz w:val="19"/>
+                <w:szCs w:val="19"/>
+                <w:highlight w:val="white"/>
+                <w:lang w:val="en-US"/>
+              </w:rPr>
+              <w:t xml:space="preserve"> inserted i </w:t>
+            </w:r>
+            <w:r>
+              <w:rPr>
+                <w:rFonts w:ascii="Cascadia Mono" w:hAnsi="Cascadia Mono" w:cs="Cascadia Mono"/>
+                <w:color w:val="0000FF"/>
+                <w:sz w:val="19"/>
+                <w:szCs w:val="19"/>
+                <w:highlight w:val="white"/>
+                <w:lang w:val="en-US"/>
+              </w:rPr>
+              <w:t>ON</w:t>
+            </w:r>
+            <w:r>
+              <w:rPr>
+                <w:rFonts w:ascii="Cascadia Mono" w:hAnsi="Cascadia Mono" w:cs="Cascadia Mono"/>
+                <w:color w:val="000000"/>
+                <w:sz w:val="19"/>
+                <w:szCs w:val="19"/>
+                <w:highlight w:val="white"/>
+                <w:lang w:val="en-US"/>
+              </w:rPr>
+              <w:t xml:space="preserve"> d</w:t>
+            </w:r>
+            <w:r>
+              <w:rPr>
+                <w:rFonts w:ascii="Cascadia Mono" w:hAnsi="Cascadia Mono" w:cs="Cascadia Mono"/>
+                <w:color w:val="808080"/>
+                <w:sz w:val="19"/>
+                <w:szCs w:val="19"/>
+                <w:highlight w:val="white"/>
+                <w:lang w:val="en-US"/>
+              </w:rPr>
+              <w:t>.</w:t>
+            </w:r>
+            <w:r>
+              <w:rPr>
+                <w:rFonts w:ascii="Cascadia Mono" w:hAnsi="Cascadia Mono" w:cs="Cascadia Mono"/>
+                <w:color w:val="000000"/>
+                <w:sz w:val="19"/>
+                <w:szCs w:val="19"/>
+                <w:highlight w:val="white"/>
+                <w:lang w:val="en-US"/>
+              </w:rPr>
+              <w:t xml:space="preserve">IDProducto </w:t>
+            </w:r>
+            <w:r>
+              <w:rPr>
+                <w:rFonts w:ascii="Cascadia Mono" w:hAnsi="Cascadia Mono" w:cs="Cascadia Mono"/>
+                <w:color w:val="808080"/>
+                <w:sz w:val="19"/>
+                <w:szCs w:val="19"/>
+                <w:highlight w:val="white"/>
+                <w:lang w:val="en-US"/>
+              </w:rPr>
+              <w:t>=</w:t>
+            </w:r>
+            <w:r>
+              <w:rPr>
+                <w:rFonts w:ascii="Cascadia Mono" w:hAnsi="Cascadia Mono" w:cs="Cascadia Mono"/>
+                <w:color w:val="000000"/>
+                <w:sz w:val="19"/>
+                <w:szCs w:val="19"/>
+                <w:highlight w:val="white"/>
+                <w:lang w:val="en-US"/>
+              </w:rPr>
+              <w:t xml:space="preserve"> i</w:t>
+            </w:r>
+            <w:r>
+              <w:rPr>
+                <w:rFonts w:ascii="Cascadia Mono" w:hAnsi="Cascadia Mono" w:cs="Cascadia Mono"/>
+                <w:color w:val="808080"/>
+                <w:sz w:val="19"/>
+                <w:szCs w:val="19"/>
+                <w:highlight w:val="white"/>
+                <w:lang w:val="en-US"/>
+              </w:rPr>
+              <w:t>.</w:t>
+            </w:r>
+            <w:r>
+              <w:rPr>
+                <w:rFonts w:ascii="Cascadia Mono" w:hAnsi="Cascadia Mono" w:cs="Cascadia Mono"/>
+                <w:color w:val="000000"/>
+                <w:sz w:val="19"/>
+                <w:szCs w:val="19"/>
+                <w:highlight w:val="white"/>
+                <w:lang w:val="en-US"/>
+              </w:rPr>
+              <w:t>IDProducto</w:t>
+            </w:r>
+          </w:p>
+          <w:p>
+            <w:pPr>
+              <w:autoSpaceDE w:val="0"/>
+              <w:autoSpaceDN w:val="0"/>
+              <w:adjustRightInd w:val="0"/>
+              <w:ind w:left="0" w:right="0" w:firstLine="0"/>
+              <w:jc w:val="left"/>
+              <w:rPr>
+                <w:rFonts w:ascii="Cascadia Mono" w:hAnsi="Cascadia Mono" w:cs="Cascadia Mono"/>
+                <w:color w:val="000000"/>
+                <w:sz w:val="19"/>
+                <w:szCs w:val="19"/>
+                <w:highlight w:val="white"/>
+              </w:rPr>
+            </w:pPr>
+            <w:r>
+              <w:rPr>
+                <w:rFonts w:ascii="Cascadia Mono" w:hAnsi="Cascadia Mono" w:cs="Cascadia Mono"/>
+                <w:color w:val="000000"/>
+                <w:sz w:val="19"/>
+                <w:szCs w:val="19"/>
+                <w:highlight w:val="white"/>
+                <w:lang w:val="en-US"/>
+              </w:rPr>
+              <w:t xml:space="preserve">    </w:t>
+            </w:r>
+            <w:r>
+              <w:rPr>
+                <w:rFonts w:ascii="Cascadia Mono" w:hAnsi="Cascadia Mono" w:cs="Cascadia Mono"/>
+                <w:color w:val="0000FF"/>
+                <w:sz w:val="19"/>
+                <w:szCs w:val="19"/>
+                <w:highlight w:val="white"/>
+              </w:rPr>
+              <w:t>WHERE</w:t>
+            </w:r>
+            <w:r>
+              <w:rPr>
+                <w:rFonts w:ascii="Cascadia Mono" w:hAnsi="Cascadia Mono" w:cs="Cascadia Mono"/>
+                <w:color w:val="000000"/>
+                <w:sz w:val="19"/>
+                <w:szCs w:val="19"/>
+                <w:highlight w:val="white"/>
+              </w:rPr>
+              <w:t xml:space="preserve"> d</w:t>
+            </w:r>
+            <w:r>
+              <w:rPr>
+                <w:rFonts w:ascii="Cascadia Mono" w:hAnsi="Cascadia Mono" w:cs="Cascadia Mono"/>
+                <w:color w:val="808080"/>
+                <w:sz w:val="19"/>
+                <w:szCs w:val="19"/>
+                <w:highlight w:val="white"/>
+              </w:rPr>
+              <w:t>.</w:t>
+            </w:r>
+            <w:r>
+              <w:rPr>
+                <w:rFonts w:ascii="Cascadia Mono" w:hAnsi="Cascadia Mono" w:cs="Cascadia Mono"/>
+                <w:color w:val="000000"/>
+                <w:sz w:val="19"/>
+                <w:szCs w:val="19"/>
+                <w:highlight w:val="white"/>
+              </w:rPr>
+              <w:t xml:space="preserve">PrecioVenta </w:t>
+            </w:r>
+            <w:r>
+              <w:rPr>
+                <w:rFonts w:ascii="Cascadia Mono" w:hAnsi="Cascadia Mono" w:cs="Cascadia Mono"/>
+                <w:color w:val="808080"/>
+                <w:sz w:val="19"/>
+                <w:szCs w:val="19"/>
+                <w:highlight w:val="white"/>
+              </w:rPr>
+              <w:t>&lt;&gt;</w:t>
+            </w:r>
+            <w:r>
+              <w:rPr>
+                <w:rFonts w:ascii="Cascadia Mono" w:hAnsi="Cascadia Mono" w:cs="Cascadia Mono"/>
+                <w:color w:val="000000"/>
+                <w:sz w:val="19"/>
+                <w:szCs w:val="19"/>
+                <w:highlight w:val="white"/>
+              </w:rPr>
+              <w:t xml:space="preserve"> i</w:t>
+            </w:r>
+            <w:r>
+              <w:rPr>
+                <w:rFonts w:ascii="Cascadia Mono" w:hAnsi="Cascadia Mono" w:cs="Cascadia Mono"/>
+                <w:color w:val="808080"/>
+                <w:sz w:val="19"/>
+                <w:szCs w:val="19"/>
+                <w:highlight w:val="white"/>
+              </w:rPr>
+              <w:t>.</w:t>
+            </w:r>
+            <w:r>
+              <w:rPr>
+                <w:rFonts w:ascii="Cascadia Mono" w:hAnsi="Cascadia Mono" w:cs="Cascadia Mono"/>
+                <w:color w:val="000000"/>
+                <w:sz w:val="19"/>
+                <w:szCs w:val="19"/>
+                <w:highlight w:val="white"/>
+              </w:rPr>
+              <w:t>PrecioVenta</w:t>
+            </w:r>
+            <w:r>
+              <w:rPr>
+                <w:rFonts w:ascii="Cascadia Mono" w:hAnsi="Cascadia Mono" w:cs="Cascadia Mono"/>
+                <w:color w:val="808080"/>
+                <w:sz w:val="19"/>
+                <w:szCs w:val="19"/>
+                <w:highlight w:val="white"/>
+              </w:rPr>
+              <w:t>;</w:t>
+            </w:r>
+          </w:p>
+          <w:p>
+            <w:pPr>
+              <w:autoSpaceDE w:val="0"/>
+              <w:autoSpaceDN w:val="0"/>
+              <w:adjustRightInd w:val="0"/>
+              <w:ind w:left="0" w:right="0" w:firstLine="0"/>
+              <w:jc w:val="left"/>
+              <w:rPr>
+                <w:rFonts w:ascii="Cascadia Mono" w:hAnsi="Cascadia Mono" w:cs="Cascadia Mono"/>
+                <w:color w:val="000000"/>
+                <w:sz w:val="19"/>
+                <w:szCs w:val="19"/>
+                <w:highlight w:val="white"/>
+              </w:rPr>
+            </w:pPr>
+            <w:r>
+              <w:rPr>
+                <w:rFonts w:ascii="Cascadia Mono" w:hAnsi="Cascadia Mono" w:cs="Cascadia Mono"/>
+                <w:color w:val="0000FF"/>
+                <w:sz w:val="19"/>
+                <w:szCs w:val="19"/>
+                <w:highlight w:val="white"/>
+              </w:rPr>
+              <w:t>END</w:t>
+            </w:r>
+            <w:r>
+              <w:rPr>
+                <w:rFonts w:ascii="Cascadia Mono" w:hAnsi="Cascadia Mono" w:cs="Cascadia Mono"/>
+                <w:color w:val="808080"/>
+                <w:sz w:val="19"/>
+                <w:szCs w:val="19"/>
+                <w:highlight w:val="white"/>
+              </w:rPr>
+              <w:t>;</w:t>
+            </w:r>
+          </w:p>
+          <w:p>
+            <w:pPr>
+              <w:keepNext/>
+              <w:keepLines/>
+              <w:spacing w:before="280" w:after="80" w:line="360" w:lineRule="auto"/>
+              <w:ind w:left="0" w:right="0" w:firstLine="0"/>
+              <w:jc w:val="left"/>
+              <w:outlineLvl w:val="2"/>
+              <w:rPr>
+                <w:rFonts w:ascii="Roboto" w:eastAsia="Roboto" w:hAnsi="Roboto" w:cs="Roboto"/>
+                <w:b/>
+                <w:bCs/>
+                <w:sz w:val="26"/>
+                <w:szCs w:val="26"/>
+                <w:lang w:val="es-419"/>
+              </w:rPr>
+            </w:pPr>
+            <w:r>
+              <w:rPr>
+                <w:rFonts w:ascii="Cascadia Mono" w:hAnsi="Cascadia Mono" w:cs="Cascadia Mono"/>
+                <w:color w:val="0000FF"/>
+                <w:sz w:val="19"/>
+                <w:szCs w:val="19"/>
+                <w:highlight w:val="white"/>
+              </w:rPr>
+              <w:t>GO</w:t>
+            </w:r>
+          </w:p>
+        </w:tc>
+      </w:tr>
+    </w:tbl>
+    <w:p>
+      <w:pPr>
+        <w:keepNext/>
+        <w:keepLines/>
+        <w:spacing w:before="280" w:after="80" w:line="360" w:lineRule="auto"/>
+        <w:ind w:left="0" w:right="0" w:firstLine="0"/>
+        <w:jc w:val="left"/>
+        <w:outlineLvl w:val="2"/>
+        <w:rPr>
+          <w:rFonts w:ascii="Roboto" w:eastAsia="Roboto" w:hAnsi="Roboto" w:cs="Roboto"/>
+          <w:b/>
+          <w:bCs/>
+          <w:sz w:val="26"/>
+          <w:szCs w:val="26"/>
+          <w:lang w:val="es-419"/>
+        </w:rPr>
+      </w:pPr>
     </w:p>
     <w:p>
       <w:pPr>

</xml_diff>